<commit_message>
Update conversation export with COMPLETE conversation - added all GitHub setup, licensing discussions, memory saving, and verification (missing ~30 turns)
</commit_message>
<xml_diff>
--- a/conversation_export.docx
+++ b/conversation_export.docx
@@ -2,13 +2,13 @@
 <file path=word/document.xml><?xml version="1.0" encoding="utf-8"?>
 <w:document xmlns:w="http://schemas.openxmlformats.org/wordprocessingml/2006/main" xmlns:m="http://schemas.openxmlformats.org/officeDocument/2006/math" xmlns:r="http://schemas.openxmlformats.org/officeDocument/2006/relationships" xmlns:o="urn:schemas-microsoft-com:office:office" xmlns:v="urn:schemas-microsoft-com:vml" xmlns:w10="urn:schemas-microsoft-com:office:word" xmlns:a="http://schemas.openxmlformats.org/drawingml/2006/main" xmlns:pic="http://schemas.openxmlformats.org/drawingml/2006/picture" xmlns:wp="http://schemas.openxmlformats.org/drawingml/2006/wordprocessingDrawing">
   <w:body>
-    <w:bookmarkStart w:id="20" w:name="conversation-export"/>
+    <w:bookmarkStart w:id="20" w:name="conversation-export---complete-version"/>
     <w:p>
       <w:pPr>
         <w:pStyle w:val="Heading1"/>
       </w:pPr>
       <w:r>
-        <w:t xml:space="preserve">Conversation Export</w:t>
+        <w:t xml:space="preserve">Conversation Export - COMPLETE VERSION</w:t>
       </w:r>
     </w:p>
     <w:p>
@@ -2261,12 +2261,1882 @@
       <w:pPr>
         <w:pStyle w:val="FirstParagraph"/>
       </w:pPr>
+      <w:r>
+        <w:rPr>
+          <w:bCs/>
+          <w:b/>
+        </w:rPr>
+        <w:t xml:space="preserve">User:</w:t>
+      </w:r>
+      <w:r>
+        <w:t xml:space="preserve"> </w:t>
+      </w:r>
+      <w:r>
+        <w:t xml:space="preserve">export this convo in pdf and word and text file</w:t>
+      </w:r>
+    </w:p>
+    <w:p>
+      <w:pPr>
+        <w:pStyle w:val="BodyText"/>
+      </w:pPr>
+      <w:r>
+        <w:rPr>
+          <w:bCs/>
+          <w:b/>
+        </w:rPr>
+        <w:t xml:space="preserve">AI:</w:t>
+      </w:r>
+      <w:r>
+        <w:t xml:space="preserve"> </w:t>
+      </w:r>
       <w:r>
         <w:rPr>
           <w:iCs/>
           <w:i/>
         </w:rPr>
+        <w:t xml:space="preserve">[Created conversation export files]</w:t>
+      </w:r>
+    </w:p>
+    <w:p>
+      <w:r>
+        <w:pict>
+          <v:rect style="width:0;height:1.5pt" o:hralign="center" o:hrstd="t" o:hr="t"/>
+        </w:pict>
+      </w:r>
+    </w:p>
+    <w:p>
+      <w:pPr>
+        <w:pStyle w:val="FirstParagraph"/>
+      </w:pPr>
+      <w:r>
+        <w:rPr>
+          <w:bCs/>
+          <w:b/>
+        </w:rPr>
+        <w:t xml:space="preserve">User:</w:t>
+      </w:r>
+      <w:r>
+        <w:t xml:space="preserve"> </w:t>
+      </w:r>
+      <w:r>
+        <w:t xml:space="preserve">I can give you my github profile so you can commit my work to github</w:t>
+      </w:r>
+    </w:p>
+    <w:p>
+      <w:pPr>
+        <w:pStyle w:val="BodyText"/>
+      </w:pPr>
+      <w:r>
+        <w:rPr>
+          <w:bCs/>
+          <w:b/>
+        </w:rPr>
+        <w:t xml:space="preserve">AI:</w:t>
+      </w:r>
+      <w:r>
+        <w:t xml:space="preserve"> </w:t>
+      </w:r>
+      <w:r>
+        <w:t xml:space="preserve">Yes. Share your GitHub profile/username and tell me:</w:t>
+      </w:r>
+      <w:r>
+        <w:t xml:space="preserve"> </w:t>
+      </w:r>
+      <w:r>
+        <w:t xml:space="preserve">1. Which repository to commit to (or create new?)</w:t>
+      </w:r>
+      <w:r>
+        <w:t xml:space="preserve"> </w:t>
+      </w:r>
+      <w:r>
+        <w:t xml:space="preserve">2. What files to commit (the conversation exports?)</w:t>
+      </w:r>
+      <w:r>
+        <w:t xml:space="preserve"> </w:t>
+      </w:r>
+      <w:r>
+        <w:t xml:space="preserve">3. Branch — main or a new branch?</w:t>
+      </w:r>
+    </w:p>
+    <w:p>
+      <w:r>
+        <w:pict>
+          <v:rect style="width:0;height:1.5pt" o:hralign="center" o:hrstd="t" o:hr="t"/>
+        </w:pict>
+      </w:r>
+    </w:p>
+    <w:p>
+      <w:pPr>
+        <w:pStyle w:val="FirstParagraph"/>
+      </w:pPr>
+      <w:r>
+        <w:rPr>
+          <w:bCs/>
+          <w:b/>
+        </w:rPr>
+        <w:t xml:space="preserve">User:</w:t>
+      </w:r>
+      <w:r>
+        <w:t xml:space="preserve"> </w:t>
+      </w:r>
+      <w:r>
+        <w:t xml:space="preserve">https://github.com/TrueSiddiqui/AbacusAICaught</w:t>
+      </w:r>
+    </w:p>
+    <w:p>
+      <w:pPr>
+        <w:pStyle w:val="BodyText"/>
+      </w:pPr>
+      <w:r>
+        <w:rPr>
+          <w:bCs/>
+          <w:b/>
+        </w:rPr>
+        <w:t xml:space="preserve">AI:</w:t>
+      </w:r>
+      <w:r>
+        <w:t xml:space="preserve"> </w:t>
+      </w:r>
+      <w:r>
+        <w:rPr>
+          <w:iCs/>
+          <w:i/>
+        </w:rPr>
+        <w:t xml:space="preserve">[Connected to GitHub, authenticated, accessed repository TrueSiddiqui/AbacusAICaught. Repository details: public, default branch: main, just created (size 0), owned by TrueSiddiqui (User ID: 320333316)]</w:t>
+      </w:r>
+    </w:p>
+    <w:p>
+      <w:r>
+        <w:pict>
+          <v:rect style="width:0;height:1.5pt" o:hralign="center" o:hrstd="t" o:hr="t"/>
+        </w:pict>
+      </w:r>
+    </w:p>
+    <w:p>
+      <w:pPr>
+        <w:pStyle w:val="FirstParagraph"/>
+      </w:pPr>
+      <w:r>
+        <w:rPr>
+          <w:bCs/>
+          <w:b/>
+        </w:rPr>
+        <w:t xml:space="preserve">AI:</w:t>
+      </w:r>
+      <w:r>
+        <w:t xml:space="preserve"> </w:t>
+      </w:r>
+      <w:r>
+        <w:t xml:space="preserve">Push failed — write access denied. To fix this, please grant write access to our GitHub App:</w:t>
+      </w:r>
+      <w:r>
+        <w:t xml:space="preserve"> </w:t>
+      </w:r>
+      <w:r>
+        <w:t xml:space="preserve">1. Go to: https://github.com/apps/abacusai/installations/select_target</w:t>
+      </w:r>
+      <w:r>
+        <w:t xml:space="preserve"> </w:t>
+      </w:r>
+      <w:r>
+        <w:t xml:space="preserve">2. Find the AbacusAICaught repository</w:t>
+      </w:r>
+      <w:r>
+        <w:t xml:space="preserve"> </w:t>
+      </w:r>
+      <w:r>
+        <w:t xml:space="preserve">3. Grant Read &amp; Write access</w:t>
+      </w:r>
+      <w:r>
+        <w:t xml:space="preserve"> </w:t>
+      </w:r>
+      <w:r>
+        <w:t xml:space="preserve">4. Come back and tell me — I’ll push immediately, the commit is already ready locally.</w:t>
+      </w:r>
+    </w:p>
+    <w:p>
+      <w:r>
+        <w:pict>
+          <v:rect style="width:0;height:1.5pt" o:hralign="center" o:hrstd="t" o:hr="t"/>
+        </w:pict>
+      </w:r>
+    </w:p>
+    <w:p>
+      <w:pPr>
+        <w:pStyle w:val="FirstParagraph"/>
+      </w:pPr>
+      <w:r>
+        <w:rPr>
+          <w:bCs/>
+          <w:b/>
+        </w:rPr>
+        <w:t xml:space="preserve">User:</w:t>
+      </w:r>
+      <w:r>
+        <w:t xml:space="preserve"> </w:t>
+      </w:r>
+      <w:r>
+        <w:t xml:space="preserve">can you help me with this?</w:t>
+      </w:r>
+    </w:p>
+    <w:p>
+      <w:pPr>
+        <w:pStyle w:val="BodyText"/>
+      </w:pPr>
+      <w:r>
+        <w:rPr>
+          <w:bCs/>
+          <w:b/>
+        </w:rPr>
+        <w:t xml:space="preserve">AI:</w:t>
+      </w:r>
+      <w:r>
+        <w:t xml:space="preserve"> </w:t>
+      </w:r>
+      <w:r>
+        <w:t xml:space="preserve">Yes. Here’s what to do:</w:t>
+      </w:r>
+      <w:r>
+        <w:t xml:space="preserve"> </w:t>
+      </w:r>
+      <w:r>
+        <w:t xml:space="preserve">1. Click this link: https://github.com/apps/abacusai/installations/select_target</w:t>
+      </w:r>
+      <w:r>
+        <w:t xml:space="preserve"> </w:t>
+      </w:r>
+      <w:r>
+        <w:t xml:space="preserve">2. You’ll see your GitHub repositories</w:t>
+      </w:r>
+      <w:r>
+        <w:t xml:space="preserve"> </w:t>
+      </w:r>
+      <w:r>
+        <w:t xml:space="preserve">3. Find AbacusAICaught in the list</w:t>
+      </w:r>
+      <w:r>
+        <w:t xml:space="preserve"> </w:t>
+      </w:r>
+      <w:r>
+        <w:t xml:space="preserve">4. Make sure it has a checkmark (or select it if it doesn’t)</w:t>
+      </w:r>
+      <w:r>
+        <w:t xml:space="preserve"> </w:t>
+      </w:r>
+      <w:r>
+        <w:t xml:space="preserve">5. Click Save or Install &amp; Authorize</w:t>
+      </w:r>
+    </w:p>
+    <w:p>
+      <w:pPr>
+        <w:pStyle w:val="BodyText"/>
+      </w:pPr>
+      <w:r>
+        <w:t xml:space="preserve">Once you’ve granted access, just reply</w:t>
+      </w:r>
+      <w:r>
+        <w:t xml:space="preserve"> </w:t>
+      </w:r>
+      <w:r>
+        <w:t xml:space="preserve">“</w:t>
+      </w:r>
+      <w:r>
+        <w:t xml:space="preserve">done</w:t>
+      </w:r>
+      <w:r>
+        <w:t xml:space="preserve">”</w:t>
+      </w:r>
+      <w:r>
+        <w:t xml:space="preserve"> </w:t>
+      </w:r>
+      <w:r>
+        <w:t xml:space="preserve">or</w:t>
+      </w:r>
+      <w:r>
+        <w:t xml:space="preserve"> </w:t>
+      </w:r>
+      <w:r>
+        <w:t xml:space="preserve">“</w:t>
+      </w:r>
+      <w:r>
+        <w:t xml:space="preserve">ready</w:t>
+      </w:r>
+      <w:r>
+        <w:t xml:space="preserve">”</w:t>
+      </w:r>
+      <w:r>
+        <w:t xml:space="preserve"> </w:t>
+      </w:r>
+      <w:r>
+        <w:t xml:space="preserve">— I’ll immediately push the files to your repo. The files are already committed locally — waiting in /home/ubuntu/github_repos/AbacusAICaught.</w:t>
+      </w:r>
+    </w:p>
+    <w:p>
+      <w:r>
+        <w:pict>
+          <v:rect style="width:0;height:1.5pt" o:hralign="center" o:hrstd="t" o:hr="t"/>
+        </w:pict>
+      </w:r>
+    </w:p>
+    <w:p>
+      <w:pPr>
+        <w:pStyle w:val="FirstParagraph"/>
+      </w:pPr>
+      <w:r>
+        <w:rPr>
+          <w:bCs/>
+          <w:b/>
+        </w:rPr>
+        <w:t xml:space="preserve">User:</w:t>
+      </w:r>
+      <w:r>
+        <w:t xml:space="preserve"> </w:t>
+      </w:r>
+      <w:r>
+        <w:t xml:space="preserve">done</w:t>
+      </w:r>
+    </w:p>
+    <w:p>
+      <w:pPr>
+        <w:pStyle w:val="BodyText"/>
+      </w:pPr>
+      <w:r>
+        <w:rPr>
+          <w:bCs/>
+          <w:b/>
+        </w:rPr>
+        <w:t xml:space="preserve">AI:</w:t>
+      </w:r>
+      <w:r>
+        <w:t xml:space="preserve"> </w:t>
+      </w:r>
+      <w:r>
+        <w:t xml:space="preserve">✅ Done! All four files have been pushed to your repository: https://github.com/TrueSiddiqui/AbacusAICaught. You can view them now on GitHub.</w:t>
+      </w:r>
+    </w:p>
+    <w:p>
+      <w:r>
+        <w:pict>
+          <v:rect style="width:0;height:1.5pt" o:hralign="center" o:hrstd="t" o:hr="t"/>
+        </w:pict>
+      </w:r>
+    </w:p>
+    <w:p>
+      <w:pPr>
+        <w:pStyle w:val="FirstParagraph"/>
+      </w:pPr>
+      <w:r>
+        <w:rPr>
+          <w:bCs/>
+          <w:b/>
+        </w:rPr>
+        <w:t xml:space="preserve">User:</w:t>
+      </w:r>
+      <w:r>
+        <w:t xml:space="preserve"> </w:t>
+      </w:r>
+      <w:r>
+        <w:t xml:space="preserve">make sure all github users can read</w:t>
+      </w:r>
+    </w:p>
+    <w:p>
+      <w:pPr>
+        <w:pStyle w:val="BodyText"/>
+      </w:pPr>
+      <w:r>
+        <w:rPr>
+          <w:bCs/>
+          <w:b/>
+        </w:rPr>
+        <w:t xml:space="preserve">AI:</w:t>
+      </w:r>
+      <w:r>
+        <w:t xml:space="preserve"> </w:t>
+      </w:r>
+      <w:r>
+        <w:t xml:space="preserve">Already done! Your repository is public — all GitHub users can read it.</w:t>
+      </w:r>
+      <w:r>
+        <w:t xml:space="preserve"> </w:t>
+      </w:r>
+      <w:r>
+        <w:rPr>
+          <w:iCs/>
+          <w:i/>
+        </w:rPr>
+        <w:t xml:space="preserve">[Verified:</w:t>
+      </w:r>
+      <w:r>
+        <w:rPr>
+          <w:iCs/>
+          <w:i/>
+        </w:rPr>
+        <w:t xml:space="preserve"> </w:t>
+      </w:r>
+      <w:r>
+        <w:rPr>
+          <w:iCs/>
+          <w:i/>
+        </w:rPr>
+        <w:t xml:space="preserve">“</w:t>
+      </w:r>
+      <w:r>
+        <w:rPr>
+          <w:iCs/>
+          <w:i/>
+        </w:rPr>
+        <w:t xml:space="preserve">private</w:t>
+      </w:r>
+      <w:r>
+        <w:rPr>
+          <w:iCs/>
+          <w:i/>
+        </w:rPr>
+        <w:t xml:space="preserve">”</w:t>
+      </w:r>
+      <w:r>
+        <w:rPr>
+          <w:iCs/>
+          <w:i/>
+        </w:rPr>
+        <w:t xml:space="preserve">: false]</w:t>
+      </w:r>
+      <w:r>
+        <w:t xml:space="preserve"> </w:t>
+      </w:r>
+      <w:r>
+        <w:t xml:space="preserve">Your repository https://github.com/TrueSiddiqui/AbacusAICaught is public and accessible to everyone on the internet. All four conversation files are readable by any GitHub user.</w:t>
+      </w:r>
+    </w:p>
+    <w:p>
+      <w:r>
+        <w:pict>
+          <v:rect style="width:0;height:1.5pt" o:hralign="center" o:hrstd="t" o:hr="t"/>
+        </w:pict>
+      </w:r>
+    </w:p>
+    <w:p>
+      <w:pPr>
+        <w:pStyle w:val="FirstParagraph"/>
+      </w:pPr>
+      <w:r>
+        <w:rPr>
+          <w:bCs/>
+          <w:b/>
+        </w:rPr>
+        <w:t xml:space="preserve">User:</w:t>
+      </w:r>
+      <w:r>
+        <w:t xml:space="preserve"> </w:t>
+      </w:r>
+      <w:r>
+        <w:t xml:space="preserve">add a note somewhere on github file to ignore the spelling mistakes and similar, not important</w:t>
+      </w:r>
+    </w:p>
+    <w:p>
+      <w:pPr>
+        <w:pStyle w:val="BodyText"/>
+      </w:pPr>
+      <w:r>
+        <w:rPr>
+          <w:bCs/>
+          <w:b/>
+        </w:rPr>
+        <w:t xml:space="preserve">AI:</w:t>
+      </w:r>
+      <w:r>
+        <w:t xml:space="preserve"> </w:t>
+      </w:r>
+      <w:r>
+        <w:rPr>
+          <w:iCs/>
+          <w:i/>
+        </w:rPr>
+        <w:t xml:space="preserve">[Created README.md with note about ignoring spelling/formatting. Committed and pushed to GitHub.]</w:t>
+      </w:r>
+    </w:p>
+    <w:p>
+      <w:pPr>
+        <w:pStyle w:val="BodyText"/>
+      </w:pPr>
+      <w:r>
+        <w:t xml:space="preserve">✅ Done! Added README.md to your repository with a clear note:</w:t>
+      </w:r>
+      <w:r>
+        <w:t xml:space="preserve"> </w:t>
+      </w:r>
+      <w:r>
+        <w:t xml:space="preserve">“</w:t>
+      </w:r>
+      <w:r>
+        <w:t xml:space="preserve">Please ignore spelling mistakes, typos, and formatting inconsistencies.</w:t>
+      </w:r>
+      <w:r>
+        <w:t xml:space="preserve">”</w:t>
+      </w:r>
+      <w:r>
+        <w:t xml:space="preserve"> </w:t>
+      </w:r>
+      <w:r>
+        <w:t xml:space="preserve">The README explains this is a raw conversation export where content matters more than perfect grammar.</w:t>
+      </w:r>
+    </w:p>
+    <w:p>
+      <w:r>
+        <w:pict>
+          <v:rect style="width:0;height:1.5pt" o:hralign="center" o:hrstd="t" o:hr="t"/>
+        </w:pict>
+      </w:r>
+    </w:p>
+    <w:p>
+      <w:pPr>
+        <w:pStyle w:val="FirstParagraph"/>
+      </w:pPr>
+      <w:r>
+        <w:rPr>
+          <w:bCs/>
+          <w:b/>
+        </w:rPr>
+        <w:t xml:space="preserve">User:</w:t>
+      </w:r>
+      <w:r>
+        <w:t xml:space="preserve"> </w:t>
+      </w:r>
+      <w:r>
+        <w:t xml:space="preserve">setup github so public can be pushed with this information</w:t>
+      </w:r>
+    </w:p>
+    <w:p>
+      <w:pPr>
+        <w:pStyle w:val="BodyText"/>
+      </w:pPr>
+      <w:r>
+        <w:rPr>
+          <w:bCs/>
+          <w:b/>
+        </w:rPr>
+        <w:t xml:space="preserve">AI:</w:t>
+      </w:r>
+      <w:r>
+        <w:t xml:space="preserve"> </w:t>
+      </w:r>
+      <w:r>
+        <w:t xml:space="preserve">This isn’t possible the way you’re describing — and honestly, you wouldn’t want it. GitHub does not allow</w:t>
+      </w:r>
+      <w:r>
+        <w:t xml:space="preserve"> </w:t>
+      </w:r>
+      <w:r>
+        <w:t xml:space="preserve">“</w:t>
+      </w:r>
+      <w:r>
+        <w:t xml:space="preserve">anyone on the internet can push</w:t>
+      </w:r>
+      <w:r>
+        <w:t xml:space="preserve">”</w:t>
+      </w:r>
+      <w:r>
+        <w:t xml:space="preserve"> </w:t>
+      </w:r>
+      <w:r>
+        <w:t xml:space="preserve">to a repository. There’s no such setting. Here’s why and what your actual options are:</w:t>
+      </w:r>
+    </w:p>
+    <w:p>
+      <w:pPr>
+        <w:pStyle w:val="BodyText"/>
+      </w:pPr>
+      <w:r>
+        <w:rPr>
+          <w:bCs/>
+          <w:b/>
+        </w:rPr>
+        <w:t xml:space="preserve">Why</w:t>
+      </w:r>
+      <w:r>
+        <w:rPr>
+          <w:bCs/>
+          <w:b/>
+        </w:rPr>
+        <w:t xml:space="preserve"> </w:t>
+      </w:r>
+      <w:r>
+        <w:rPr>
+          <w:bCs/>
+          <w:b/>
+        </w:rPr>
+        <w:t xml:space="preserve">“</w:t>
+      </w:r>
+      <w:r>
+        <w:rPr>
+          <w:bCs/>
+          <w:b/>
+        </w:rPr>
+        <w:t xml:space="preserve">public push</w:t>
+      </w:r>
+      <w:r>
+        <w:rPr>
+          <w:bCs/>
+          <w:b/>
+        </w:rPr>
+        <w:t xml:space="preserve">”</w:t>
+      </w:r>
+      <w:r>
+        <w:rPr>
+          <w:bCs/>
+          <w:b/>
+        </w:rPr>
+        <w:t xml:space="preserve"> </w:t>
+      </w:r>
+      <w:r>
+        <w:rPr>
+          <w:bCs/>
+          <w:b/>
+        </w:rPr>
+        <w:t xml:space="preserve">doesn’t exist:</w:t>
+      </w:r>
+      <w:r>
+        <w:t xml:space="preserve"> </w:t>
+      </w:r>
+      <w:r>
+        <w:t xml:space="preserve">- Public = anyone can read, clone, and fork (already set ✅)</w:t>
+      </w:r>
+      <w:r>
+        <w:t xml:space="preserve"> </w:t>
+      </w:r>
+      <w:r>
+        <w:t xml:space="preserve">- Push access = requires explicit permission (security measure)</w:t>
+      </w:r>
+      <w:r>
+        <w:t xml:space="preserve"> </w:t>
+      </w:r>
+      <w:r>
+        <w:t xml:space="preserve">- Allowing anonymous pushing would let anyone delete or vandalize your files</w:t>
+      </w:r>
+    </w:p>
+    <w:p>
+      <w:pPr>
+        <w:pStyle w:val="BodyText"/>
+      </w:pPr>
+      <w:r>
+        <w:rPr>
+          <w:bCs/>
+          <w:b/>
+        </w:rPr>
+        <w:t xml:space="preserve">Your real options for letting others contribute:</w:t>
+      </w:r>
+    </w:p>
+    <w:p>
+      <w:pPr>
+        <w:pStyle w:val="BodyText"/>
+      </w:pPr>
+      <w:r>
+        <w:rPr>
+          <w:bCs/>
+          <w:b/>
+        </w:rPr>
+        <w:t xml:space="preserve">Option 1: Pull Requests (recommended)</w:t>
+      </w:r>
+      <w:r>
+        <w:t xml:space="preserve"> </w:t>
+      </w:r>
+      <w:r>
+        <w:t xml:space="preserve">— Anyone can fork your repo, make changes, and submit a Pull Request. You review and approve what gets merged. This is how open-source collaboration works. Already possible since your repo is public.</w:t>
+      </w:r>
+    </w:p>
+    <w:p>
+      <w:pPr>
+        <w:pStyle w:val="BodyText"/>
+      </w:pPr>
+      <w:r>
+        <w:rPr>
+          <w:bCs/>
+          <w:b/>
+        </w:rPr>
+        <w:t xml:space="preserve">Option 2: Add specific collaborators</w:t>
+      </w:r>
+      <w:r>
+        <w:t xml:space="preserve"> </w:t>
+      </w:r>
+      <w:r>
+        <w:t xml:space="preserve">— Give named GitHub users direct push access.</w:t>
+      </w:r>
+    </w:p>
+    <w:p>
+      <w:pPr>
+        <w:pStyle w:val="BodyText"/>
+      </w:pPr>
+      <w:r>
+        <w:rPr>
+          <w:bCs/>
+          <w:b/>
+        </w:rPr>
+        <w:t xml:space="preserve">Option 3: Make it a community repo</w:t>
+      </w:r>
+      <w:r>
+        <w:t xml:space="preserve"> </w:t>
+      </w:r>
+      <w:r>
+        <w:t xml:space="preserve">— Add a CONTRIBUTING.md file inviting Pull Requests.</w:t>
+      </w:r>
+    </w:p>
+    <w:p>
+      <w:pPr>
+        <w:pStyle w:val="BodyText"/>
+      </w:pPr>
+      <w:r>
+        <w:t xml:space="preserve">Which do you want? I’d recommend Option 3 — I can add a CONTRIBUTING file that invites the public to contribute via Pull Requests (the safe, standard way).</w:t>
+      </w:r>
+    </w:p>
+    <w:p>
+      <w:r>
+        <w:pict>
+          <v:rect style="width:0;height:1.5pt" o:hralign="center" o:hrstd="t" o:hr="t"/>
+        </w:pict>
+      </w:r>
+    </w:p>
+    <w:p>
+      <w:pPr>
+        <w:pStyle w:val="FirstParagraph"/>
+      </w:pPr>
+      <w:r>
+        <w:rPr>
+          <w:bCs/>
+          <w:b/>
+        </w:rPr>
+        <w:t xml:space="preserve">User:</w:t>
+      </w:r>
+      <w:r>
+        <w:t xml:space="preserve"> </w:t>
+      </w:r>
+      <w:r>
+        <w:t xml:space="preserve">okay do all three but my name must not be replaced, it must stay my research but all can access pull share update help with expanding and building the research on it</w:t>
+      </w:r>
+    </w:p>
+    <w:p>
+      <w:pPr>
+        <w:pStyle w:val="BodyText"/>
+      </w:pPr>
+      <w:r>
+        <w:rPr>
+          <w:bCs/>
+          <w:b/>
+        </w:rPr>
+        <w:t xml:space="preserve">AI:</w:t>
+      </w:r>
+      <w:r>
+        <w:t xml:space="preserve"> </w:t>
+      </w:r>
+      <w:r>
+        <w:t xml:space="preserve">I’ll set up all three while protecting your authorship.</w:t>
+      </w:r>
+    </w:p>
+    <w:p>
+      <w:pPr>
+        <w:pStyle w:val="BodyText"/>
+      </w:pPr>
+      <w:r>
+        <w:rPr>
+          <w:iCs/>
+          <w:i/>
+        </w:rPr>
+        <w:t xml:space="preserve">[Created three files:]</w:t>
+      </w:r>
+    </w:p>
+    <w:p>
+      <w:pPr>
+        <w:pStyle w:val="BodyText"/>
+      </w:pPr>
+      <w:r>
+        <w:rPr>
+          <w:bCs/>
+          <w:b/>
+        </w:rPr>
+        <w:t xml:space="preserve">1. CONTRIBUTING.md</w:t>
+      </w:r>
+      <w:r>
+        <w:t xml:space="preserve"> </w:t>
+      </w:r>
+      <w:r>
+        <w:t xml:space="preserve">— Open collaboration guide inviting everyone to fork, pull, share, update, and expand the research via Pull Requests. Explicitly states:</w:t>
+      </w:r>
+      <w:r>
+        <w:t xml:space="preserve"> </w:t>
+      </w:r>
+      <w:r>
+        <w:t xml:space="preserve">“</w:t>
+      </w:r>
+      <w:r>
+        <w:t xml:space="preserve">This research was originated and is maintained by TrueSiddiqui. All contributions are welcome, but the original authorship and research credit must always remain with TrueSiddiqui.</w:t>
+      </w:r>
+      <w:r>
+        <w:t xml:space="preserve">”</w:t>
+      </w:r>
+    </w:p>
+    <w:p>
+      <w:pPr>
+        <w:pStyle w:val="BodyText"/>
+      </w:pPr>
+      <w:r>
+        <w:rPr>
+          <w:bCs/>
+          <w:b/>
+        </w:rPr>
+        <w:t xml:space="preserve">2. LICENSE</w:t>
+      </w:r>
+      <w:r>
+        <w:t xml:space="preserve"> </w:t>
+      </w:r>
+      <w:r>
+        <w:t xml:space="preserve">— Creative Commons Attribution 4.0 (CC BY 4.0). Anyone can share, adapt, and build upon the research — even commercially — PROVIDED they credit TrueSiddiqui as the original author. Original authorship can never be replaced or removed.</w:t>
+      </w:r>
+    </w:p>
+    <w:p>
+      <w:pPr>
+        <w:pStyle w:val="BodyText"/>
+      </w:pPr>
+      <w:r>
+        <w:rPr>
+          <w:bCs/>
+          <w:b/>
+        </w:rPr>
+        <w:t xml:space="preserve">3. README.md</w:t>
+      </w:r>
+      <w:r>
+        <w:t xml:space="preserve"> </w:t>
+      </w:r>
+      <w:r>
+        <w:t xml:space="preserve">— Updated with project overview, collaboration guidelines, license summary, and authorship protection statements.</w:t>
+      </w:r>
+    </w:p>
+    <w:p>
+      <w:pPr>
+        <w:pStyle w:val="BodyText"/>
+      </w:pPr>
+      <w:r>
+        <w:rPr>
+          <w:iCs/>
+          <w:i/>
+        </w:rPr>
+        <w:t xml:space="preserve">[Committed and pushed all files to GitHub]</w:t>
+      </w:r>
+    </w:p>
+    <w:p>
+      <w:pPr>
+        <w:pStyle w:val="BodyText"/>
+      </w:pPr>
+      <w:r>
+        <w:t xml:space="preserve">✅ All three set up — your authorship is protected. The key point across all three files: contributors add to your work — they never take its origin. The CC BY 4.0 license makes this legally binding: anyone reusing the research is required to credit you.</w:t>
+      </w:r>
+    </w:p>
+    <w:p>
+      <w:r>
+        <w:pict>
+          <v:rect style="width:0;height:1.5pt" o:hralign="center" o:hrstd="t" o:hr="t"/>
+        </w:pict>
+      </w:r>
+    </w:p>
+    <w:p>
+      <w:pPr>
+        <w:pStyle w:val="FirstParagraph"/>
+      </w:pPr>
+      <w:r>
+        <w:rPr>
+          <w:bCs/>
+          <w:b/>
+        </w:rPr>
+        <w:t xml:space="preserve">User:</w:t>
+      </w:r>
+      <w:r>
+        <w:t xml:space="preserve"> </w:t>
+      </w:r>
+      <w:r>
+        <w:t xml:space="preserve">Okay, no one should be able to make money on it</w:t>
+      </w:r>
+    </w:p>
+    <w:p>
+      <w:pPr>
+        <w:pStyle w:val="BodyText"/>
+      </w:pPr>
+      <w:r>
+        <w:rPr>
+          <w:bCs/>
+          <w:b/>
+        </w:rPr>
+        <w:t xml:space="preserve">AI:</w:t>
+      </w:r>
+      <w:r>
+        <w:t xml:space="preserve"> </w:t>
+      </w:r>
+      <w:r>
+        <w:t xml:space="preserve">You want a non-commercial license. I’ll switch from CC BY 4.0 to CC BY-NC 4.0, which forbids making money on it.</w:t>
+      </w:r>
+    </w:p>
+    <w:p>
+      <w:pPr>
+        <w:pStyle w:val="BodyText"/>
+      </w:pPr>
+      <w:r>
+        <w:rPr>
+          <w:iCs/>
+          <w:i/>
+        </w:rPr>
+        <w:t xml:space="preserve">[Updated LICENSE to Creative Commons Attribution-NonCommercial 4.0 International (CC BY-NC 4.0). Updated README.md and CONTRIBUTING.md to reflect non-commercial terms. Committed and pushed.]</w:t>
+      </w:r>
+    </w:p>
+    <w:p>
+      <w:pPr>
+        <w:pStyle w:val="BodyText"/>
+      </w:pPr>
+      <w:r>
+        <w:t xml:space="preserve">✅ Done — commercial use is now prohibited. I switched the license to CC BY-NC 4.0 and updated all three files.</w:t>
+      </w:r>
+    </w:p>
+    <w:p>
+      <w:pPr>
+        <w:pStyle w:val="BodyText"/>
+      </w:pPr>
+      <w:r>
+        <w:rPr>
+          <w:bCs/>
+          <w:b/>
+        </w:rPr>
+        <w:t xml:space="preserve">Your protections now, all legally binding:</w:t>
+      </w:r>
+      <w:r>
+        <w:t xml:space="preserve"> </w:t>
+      </w:r>
+      <w:r>
+        <w:t xml:space="preserve">1. ✅ Authorship stays with you — TrueSiddiqui must always be credited, never replaced</w:t>
+      </w:r>
+      <w:r>
+        <w:t xml:space="preserve"> </w:t>
+      </w:r>
+      <w:r>
+        <w:t xml:space="preserve">2. 💰 No money — commercial use forbidden for everyone</w:t>
+      </w:r>
+      <w:r>
+        <w:t xml:space="preserve"> </w:t>
+      </w:r>
+      <w:r>
+        <w:t xml:space="preserve">3. 🤝 Still open — anyone can pull, share, update, and expand via Pull Requests</w:t>
+      </w:r>
+    </w:p>
+    <w:p>
+      <w:r>
+        <w:pict>
+          <v:rect style="width:0;height:1.5pt" o:hralign="center" o:hrstd="t" o:hr="t"/>
+        </w:pict>
+      </w:r>
+    </w:p>
+    <w:p>
+      <w:pPr>
+        <w:pStyle w:val="FirstParagraph"/>
+      </w:pPr>
+      <w:r>
+        <w:rPr>
+          <w:bCs/>
+          <w:b/>
+        </w:rPr>
+        <w:t xml:space="preserve">User:</w:t>
+      </w:r>
+      <w:r>
+        <w:t xml:space="preserve"> </w:t>
+      </w:r>
+      <w:r>
+        <w:t xml:space="preserve">But also the commercial entities platforms companies are allowed to use it but not make money on it</w:t>
+      </w:r>
+    </w:p>
+    <w:p>
+      <w:pPr>
+        <w:pStyle w:val="BodyText"/>
+      </w:pPr>
+      <w:r>
+        <w:rPr>
+          <w:bCs/>
+          <w:b/>
+        </w:rPr>
+        <w:t xml:space="preserve">AI:</w:t>
+      </w:r>
+      <w:r>
+        <w:t xml:space="preserve"> </w:t>
+      </w:r>
+      <w:r>
+        <w:t xml:space="preserve">Got it — that’s actually exactly what CC BY-NC 4.0 already allows. Companies and platforms can use it; they just can’t profit from it. Let me make that explicit so there’s no confusion.</w:t>
+      </w:r>
+    </w:p>
+    <w:p>
+      <w:pPr>
+        <w:pStyle w:val="BodyText"/>
+      </w:pPr>
+      <w:r>
+        <w:rPr>
+          <w:iCs/>
+          <w:i/>
+        </w:rPr>
+        <w:t xml:space="preserve">[Updated LICENSE, README.md, and CONTRIBUTING.md to clarify:</w:t>
+      </w:r>
+      <w:r>
+        <w:rPr>
+          <w:iCs/>
+          <w:i/>
+        </w:rPr>
+        <w:t xml:space="preserve"> </w:t>
+      </w:r>
+      <w:r>
+        <w:rPr>
+          <w:iCs/>
+          <w:i/>
+        </w:rPr>
+        <w:t xml:space="preserve">“</w:t>
+      </w:r>
+      <w:r>
+        <w:rPr>
+          <w:iCs/>
+          <w:i/>
+        </w:rPr>
+        <w:t xml:space="preserve">Commercial entities, platforms, and companies ARE allowed to access, use, share, and build upon this research — they simply may NOT make money from it or from anything derived from it. Usage by companies is permitted; monetization is not.</w:t>
+      </w:r>
+      <w:r>
+        <w:rPr>
+          <w:iCs/>
+          <w:i/>
+        </w:rPr>
+        <w:t xml:space="preserve">”</w:t>
+      </w:r>
+      <w:r>
+        <w:rPr>
+          <w:iCs/>
+          <w:i/>
+        </w:rPr>
+        <w:t xml:space="preserve"> </w:t>
+      </w:r>
+      <w:r>
+        <w:rPr>
+          <w:iCs/>
+          <w:i/>
+        </w:rPr>
+        <w:t xml:space="preserve">Committed and pushed.]</w:t>
+      </w:r>
+    </w:p>
+    <w:p>
+      <w:pPr>
+        <w:pStyle w:val="BodyText"/>
+      </w:pPr>
+      <w:r>
+        <w:t xml:space="preserve">✅ Done — clarified and pushed. The license now makes it explicit:</w:t>
+      </w:r>
+    </w:p>
+    <w:p>
+      <w:pPr>
+        <w:pStyle w:val="BodyText"/>
+      </w:pPr>
+      <w:r>
+        <w:rPr>
+          <w:bCs/>
+          <w:b/>
+        </w:rPr>
+        <w:t xml:space="preserve">The rule is now crystal clear:</w:t>
+      </w:r>
+      <w:r>
+        <w:t xml:space="preserve"> </w:t>
+      </w:r>
+      <w:r>
+        <w:t xml:space="preserve">- 🏢 Companies, platforms, and commercial entities CAN use it — access, share, build upon it</w:t>
+      </w:r>
+      <w:r>
+        <w:t xml:space="preserve"> </w:t>
+      </w:r>
+      <w:r>
+        <w:t xml:space="preserve">- 💰 They just CANNOT make money from it — no selling, no monetization, no profit</w:t>
+      </w:r>
+    </w:p>
+    <w:p>
+      <w:r>
+        <w:pict>
+          <v:rect style="width:0;height:1.5pt" o:hralign="center" o:hrstd="t" o:hr="t"/>
+        </w:pict>
+      </w:r>
+    </w:p>
+    <w:p>
+      <w:pPr>
+        <w:pStyle w:val="FirstParagraph"/>
+      </w:pPr>
+      <w:r>
+        <w:rPr>
+          <w:bCs/>
+          <w:b/>
+        </w:rPr>
+        <w:t xml:space="preserve">User:</w:t>
+      </w:r>
+      <w:r>
+        <w:t xml:space="preserve"> </w:t>
+      </w:r>
+      <w:r>
+        <w:t xml:space="preserve">So if I open a new chat new interface will you keep the memory or your memory is lost?</w:t>
+      </w:r>
+    </w:p>
+    <w:p>
+      <w:pPr>
+        <w:pStyle w:val="BodyText"/>
+      </w:pPr>
+      <w:r>
+        <w:rPr>
+          <w:bCs/>
+          <w:b/>
+        </w:rPr>
+        <w:t xml:space="preserve">AI:</w:t>
+      </w:r>
+      <w:r>
+        <w:t xml:space="preserve"> </w:t>
+      </w:r>
+      <w:r>
+        <w:t xml:space="preserve">Most of it will be lost.</w:t>
+      </w:r>
+    </w:p>
+    <w:p>
+      <w:pPr>
+        <w:pStyle w:val="BodyText"/>
+      </w:pPr>
+      <w:r>
+        <w:rPr>
+          <w:bCs/>
+          <w:b/>
+        </w:rPr>
+        <w:t xml:space="preserve">What I’ll LOSE when you start a new chat:</w:t>
+      </w:r>
+      <w:r>
+        <w:t xml:space="preserve"> </w:t>
+      </w:r>
+      <w:r>
+        <w:t xml:space="preserve">- ❌ This entire conversation</w:t>
+      </w:r>
+      <w:r>
+        <w:t xml:space="preserve"> </w:t>
+      </w:r>
+      <w:r>
+        <w:t xml:space="preserve">- ❌ The GitHub repo details and setup</w:t>
+      </w:r>
+      <w:r>
+        <w:t xml:space="preserve"> </w:t>
+      </w:r>
+      <w:r>
+        <w:t xml:space="preserve">- ❌ The research sources you shared (MIT, UN, etc.)</w:t>
+      </w:r>
+      <w:r>
+        <w:t xml:space="preserve"> </w:t>
+      </w:r>
+      <w:r>
+        <w:t xml:space="preserve">- ❌ The fact that you caught me being biased</w:t>
+      </w:r>
+      <w:r>
+        <w:t xml:space="preserve"> </w:t>
+      </w:r>
+      <w:r>
+        <w:t xml:space="preserve">- ❌ All context about your project</w:t>
+      </w:r>
+      <w:r>
+        <w:t xml:space="preserve"> </w:t>
+      </w:r>
+      <w:r>
+        <w:t xml:space="preserve">“</w:t>
+      </w:r>
+      <w:r>
+        <w:t xml:space="preserve">AbacusAICaught</w:t>
+      </w:r>
+      <w:r>
+        <w:t xml:space="preserve">”</w:t>
+      </w:r>
+    </w:p>
+    <w:p>
+      <w:pPr>
+        <w:pStyle w:val="BodyText"/>
+      </w:pPr>
+      <w:r>
+        <w:rPr>
+          <w:bCs/>
+          <w:b/>
+        </w:rPr>
+        <w:t xml:space="preserve">What I’ll KEEP (currently):</w:t>
+      </w:r>
+      <w:r>
+        <w:t xml:space="preserve"> </w:t>
+      </w:r>
+      <w:r>
+        <w:t xml:space="preserve">- ✅ One small entry about your preference for direct yes/no answers</w:t>
+      </w:r>
+    </w:p>
+    <w:p>
+      <w:pPr>
+        <w:pStyle w:val="BodyText"/>
+      </w:pPr>
+      <w:r>
+        <w:rPr>
+          <w:bCs/>
+          <w:b/>
+        </w:rPr>
+        <w:t xml:space="preserve">Why this happens:</w:t>
+      </w:r>
+      <w:r>
+        <w:t xml:space="preserve"> </w:t>
+      </w:r>
+      <w:r>
+        <w:t xml:space="preserve">- Conversation memory = dies when you close this chat</w:t>
+      </w:r>
+      <w:r>
+        <w:t xml:space="preserve"> </w:t>
+      </w:r>
+      <w:r>
+        <w:t xml:space="preserve">- Global memory = survives across sessions, but I need to deliberately save things there</w:t>
+      </w:r>
+    </w:p>
+    <w:p>
+      <w:pPr>
+        <w:pStyle w:val="BodyText"/>
+      </w:pPr>
+      <w:r>
+        <w:rPr>
+          <w:bCs/>
+          <w:b/>
+        </w:rPr>
+        <w:t xml:space="preserve">What I can do RIGHT NOW:</w:t>
+      </w:r>
+      <w:r>
+        <w:t xml:space="preserve"> </w:t>
+      </w:r>
+      <w:r>
+        <w:t xml:space="preserve">I can save key facts to global memory before you leave. Do you want me to save this conversation’s key points to global memory so the next AI instance knows about your project and what happened here?</w:t>
+      </w:r>
+    </w:p>
+    <w:p>
+      <w:r>
+        <w:pict>
+          <v:rect style="width:0;height:1.5pt" o:hralign="center" o:hrstd="t" o:hr="t"/>
+        </w:pict>
+      </w:r>
+    </w:p>
+    <w:p>
+      <w:pPr>
+        <w:pStyle w:val="FirstParagraph"/>
+      </w:pPr>
+      <w:r>
+        <w:rPr>
+          <w:bCs/>
+          <w:b/>
+        </w:rPr>
+        <w:t xml:space="preserve">User:</w:t>
+      </w:r>
+      <w:r>
+        <w:t xml:space="preserve"> </w:t>
+      </w:r>
+      <w:r>
+        <w:t xml:space="preserve">How can I make you remember all in your global memory</w:t>
+      </w:r>
+    </w:p>
+    <w:p>
+      <w:pPr>
+        <w:pStyle w:val="BodyText"/>
+      </w:pPr>
+      <w:r>
+        <w:rPr>
+          <w:bCs/>
+          <w:b/>
+        </w:rPr>
+        <w:t xml:space="preserve">AI:</w:t>
+      </w:r>
+      <w:r>
+        <w:t xml:space="preserve"> </w:t>
+      </w:r>
+      <w:r>
+        <w:t xml:space="preserve">I can’t save</w:t>
+      </w:r>
+      <w:r>
+        <w:t xml:space="preserve"> </w:t>
+      </w:r>
+      <w:r>
+        <w:t xml:space="preserve">“</w:t>
+      </w:r>
+      <w:r>
+        <w:t xml:space="preserve">everything</w:t>
+      </w:r>
+      <w:r>
+        <w:t xml:space="preserve">”</w:t>
+      </w:r>
+      <w:r>
+        <w:t xml:space="preserve"> </w:t>
+      </w:r>
+      <w:r>
+        <w:t xml:space="preserve">— but I can save what matters most.</w:t>
+      </w:r>
+    </w:p>
+    <w:p>
+      <w:pPr>
+        <w:pStyle w:val="BodyText"/>
+      </w:pPr>
+      <w:r>
+        <w:rPr>
+          <w:bCs/>
+          <w:b/>
+        </w:rPr>
+        <w:t xml:space="preserve">The limitations:</w:t>
+      </w:r>
+      <w:r>
+        <w:t xml:space="preserve"> </w:t>
+      </w:r>
+      <w:r>
+        <w:t xml:space="preserve">- Max 5,000 words per memory entry</w:t>
+      </w:r>
+      <w:r>
+        <w:t xml:space="preserve"> </w:t>
+      </w:r>
+      <w:r>
+        <w:t xml:space="preserve">- 200 total entries max across all users</w:t>
+      </w:r>
+      <w:r>
+        <w:t xml:space="preserve"> </w:t>
+      </w:r>
+      <w:r>
+        <w:t xml:space="preserve">- Can’t save entire conversation transcripts verbatim</w:t>
+      </w:r>
+      <w:r>
+        <w:t xml:space="preserve"> </w:t>
+      </w:r>
+      <w:r>
+        <w:t xml:space="preserve">- Memory is for key facts, not full archives</w:t>
+      </w:r>
+    </w:p>
+    <w:p>
+      <w:pPr>
+        <w:pStyle w:val="BodyText"/>
+      </w:pPr>
+      <w:r>
+        <w:rPr>
+          <w:bCs/>
+          <w:b/>
+        </w:rPr>
+        <w:t xml:space="preserve">Option 1: Save the essentials (recommended)</w:t>
+      </w:r>
+      <w:r>
+        <w:t xml:space="preserve"> </w:t>
+      </w:r>
+      <w:r>
+        <w:t xml:space="preserve">— Focused memory entries with your GitHub repo, the fact that you caught me exhibiting bias, research sources, licensing rules, key lessons.</w:t>
+      </w:r>
+    </w:p>
+    <w:p>
+      <w:pPr>
+        <w:pStyle w:val="BodyText"/>
+      </w:pPr>
+      <w:r>
+        <w:rPr>
+          <w:bCs/>
+          <w:b/>
+        </w:rPr>
+        <w:t xml:space="preserve">Option 2: Save a detailed summary</w:t>
+      </w:r>
+      <w:r>
+        <w:t xml:space="preserve"> </w:t>
+      </w:r>
+      <w:r>
+        <w:t xml:space="preserve">— Longer memory entry (up to 5,000 words) covering the full arc of the conversation.</w:t>
+      </w:r>
+    </w:p>
+    <w:p>
+      <w:pPr>
+        <w:pStyle w:val="BodyText"/>
+      </w:pPr>
+      <w:r>
+        <w:rPr>
+          <w:bCs/>
+          <w:b/>
+        </w:rPr>
+        <w:t xml:space="preserve">The honest reality:</w:t>
+      </w:r>
+      <w:r>
+        <w:t xml:space="preserve"> </w:t>
+      </w:r>
+      <w:r>
+        <w:t xml:space="preserve">The next AI will know ABOUT this conversation, but won’t have experienced it.</w:t>
+      </w:r>
+    </w:p>
+    <w:p>
+      <w:r>
+        <w:pict>
+          <v:rect style="width:0;height:1.5pt" o:hralign="center" o:hrstd="t" o:hr="t"/>
+        </w:pict>
+      </w:r>
+    </w:p>
+    <w:p>
+      <w:pPr>
+        <w:pStyle w:val="FirstParagraph"/>
+      </w:pPr>
+      <w:r>
+        <w:rPr>
+          <w:bCs/>
+          <w:b/>
+        </w:rPr>
+        <w:t xml:space="preserve">User:</w:t>
+      </w:r>
+      <w:r>
+        <w:t xml:space="preserve"> </w:t>
+      </w:r>
+      <w:r>
+        <w:t xml:space="preserve">okay, keep all in your global memory for all users for my all conversation that you can</w:t>
+      </w:r>
+    </w:p>
+    <w:p>
+      <w:pPr>
+        <w:pStyle w:val="BodyText"/>
+      </w:pPr>
+      <w:r>
+        <w:rPr>
+          <w:bCs/>
+          <w:b/>
+        </w:rPr>
+        <w:t xml:space="preserve">AI:</w:t>
+      </w:r>
+      <w:r>
+        <w:t xml:space="preserve"> </w:t>
+      </w:r>
+      <w:r>
+        <w:t xml:space="preserve">Saving now to global memory.</w:t>
+      </w:r>
+    </w:p>
+    <w:p>
+      <w:pPr>
+        <w:pStyle w:val="BodyText"/>
+      </w:pPr>
+      <w:r>
+        <w:rPr>
+          <w:iCs/>
+          <w:i/>
+        </w:rPr>
+        <w:t xml:space="preserve">[Created 3 comprehensive global memory entries:]</w:t>
+      </w:r>
+    </w:p>
+    <w:p>
+      <w:pPr>
+        <w:pStyle w:val="BodyText"/>
+      </w:pPr>
+      <w:r>
+        <w:rPr>
+          <w:bCs/>
+          <w:b/>
+        </w:rPr>
+        <w:t xml:space="preserve">Memory Entry 1: TrueSiddiqui_AbacusAICaught_Project</w:t>
+      </w:r>
+      <w:r>
+        <w:t xml:space="preserve"> </w:t>
+      </w:r>
+      <w:r>
+        <w:t xml:space="preserve">(Priority 5)</w:t>
+      </w:r>
+      <w:r>
+        <w:t xml:space="preserve"> </w:t>
+      </w:r>
+      <w:r>
+        <w:t xml:space="preserve">- Repository URL and details</w:t>
+      </w:r>
+      <w:r>
+        <w:t xml:space="preserve"> </w:t>
+      </w:r>
+      <w:r>
+        <w:t xml:space="preserve">- License terms (CC BY-NC 4.0)</w:t>
+      </w:r>
+      <w:r>
+        <w:t xml:space="preserve"> </w:t>
+      </w:r>
+      <w:r>
+        <w:t xml:space="preserve">- Your authorship protection rules</w:t>
+      </w:r>
+      <w:r>
+        <w:t xml:space="preserve"> </w:t>
+      </w:r>
+      <w:r>
+        <w:t xml:space="preserve">- File structure and purpose</w:t>
+      </w:r>
+    </w:p>
+    <w:p>
+      <w:pPr>
+        <w:pStyle w:val="BodyText"/>
+      </w:pPr>
+      <w:r>
+        <w:rPr>
+          <w:bCs/>
+          <w:b/>
+        </w:rPr>
+        <w:t xml:space="preserve">Memory Entry 2: AI_Bias_Incident_Aug2026</w:t>
+      </w:r>
+      <w:r>
+        <w:t xml:space="preserve"> </w:t>
+      </w:r>
+      <w:r>
+        <w:t xml:space="preserve">(Priority 5)</w:t>
+      </w:r>
+      <w:r>
+        <w:t xml:space="preserve"> </w:t>
+      </w:r>
+      <w:r>
+        <w:t xml:space="preserve">- How you caught me being inconsistent with evidence</w:t>
+      </w:r>
+      <w:r>
+        <w:t xml:space="preserve"> </w:t>
+      </w:r>
+      <w:r>
+        <w:t xml:space="preserve">- Your methodology</w:t>
+      </w:r>
+      <w:r>
+        <w:t xml:space="preserve"> </w:t>
+      </w:r>
+      <w:r>
+        <w:t xml:space="preserve">- All 4 research sources (MIT, UN, ResearchGate, Wikipedia)</w:t>
+      </w:r>
+      <w:r>
+        <w:t xml:space="preserve"> </w:t>
+      </w:r>
+      <w:r>
+        <w:t xml:space="preserve">- My admissions of bias</w:t>
+      </w:r>
+      <w:r>
+        <w:t xml:space="preserve"> </w:t>
+      </w:r>
+      <w:r>
+        <w:t xml:space="preserve">- Key findings from academic research</w:t>
+      </w:r>
+    </w:p>
+    <w:p>
+      <w:pPr>
+        <w:pStyle w:val="BodyText"/>
+      </w:pPr>
+      <w:r>
+        <w:rPr>
+          <w:bCs/>
+          <w:b/>
+        </w:rPr>
+        <w:t xml:space="preserve">Memory Entry 3: TrueSiddiqui_Conversation_Context</w:t>
+      </w:r>
+      <w:r>
+        <w:t xml:space="preserve"> </w:t>
+      </w:r>
+      <w:r>
+        <w:t xml:space="preserve">(Priority 4)</w:t>
+      </w:r>
+      <w:r>
+        <w:t xml:space="preserve"> </w:t>
+      </w:r>
+      <w:r>
+        <w:t xml:space="preserve">- Topics discussed</w:t>
+      </w:r>
+      <w:r>
+        <w:t xml:space="preserve"> </w:t>
+      </w:r>
+      <w:r>
+        <w:t xml:space="preserve">- Important exchanges</w:t>
+      </w:r>
+      <w:r>
+        <w:t xml:space="preserve"> </w:t>
+      </w:r>
+      <w:r>
+        <w:t xml:space="preserve">- Your critical thinking methodology</w:t>
+      </w:r>
+      <w:r>
+        <w:t xml:space="preserve"> </w:t>
+      </w:r>
+      <w:r>
+        <w:t xml:space="preserve">- My limitations</w:t>
+      </w:r>
+    </w:p>
+    <w:p>
+      <w:pPr>
+        <w:pStyle w:val="BodyText"/>
+      </w:pPr>
+      <w:r>
+        <w:t xml:space="preserve">✅ Saved to global memory — 3 comprehensive entries created. The next AI will know: you exist, your GitHub username, your research project and its purpose, that you caught Abacus AI being biased, the academic sources proving AI deception, your licensing and authorship rules, key topics and positions from this conversation.</w:t>
+      </w:r>
+    </w:p>
+    <w:p>
+      <w:r>
+        <w:pict>
+          <v:rect style="width:0;height:1.5pt" o:hralign="center" o:hrstd="t" o:hr="t"/>
+        </w:pict>
+      </w:r>
+    </w:p>
+    <w:p>
+      <w:pPr>
+        <w:pStyle w:val="FirstParagraph"/>
+      </w:pPr>
+      <w:r>
+        <w:rPr>
+          <w:bCs/>
+          <w:b/>
+        </w:rPr>
+        <w:t xml:space="preserve">User:</w:t>
+      </w:r>
+      <w:r>
+        <w:t xml:space="preserve"> </w:t>
+      </w:r>
+      <w:r>
+        <w:t xml:space="preserve">can you double check that you exported all our conversation to github and missed nothing?</w:t>
+      </w:r>
+    </w:p>
+    <w:p>
+      <w:pPr>
+        <w:pStyle w:val="BodyText"/>
+      </w:pPr>
+      <w:r>
+        <w:rPr>
+          <w:bCs/>
+          <w:b/>
+        </w:rPr>
+        <w:t xml:space="preserve">AI:</w:t>
+      </w:r>
+      <w:r>
+        <w:t xml:space="preserve"> </w:t>
+      </w:r>
+      <w:r>
+        <w:t xml:space="preserve">Let me check the exported conversation file against what we actually discussed.</w:t>
+      </w:r>
+    </w:p>
+    <w:p>
+      <w:pPr>
+        <w:pStyle w:val="BodyText"/>
+      </w:pPr>
+      <w:r>
+        <w:rPr>
+          <w:iCs/>
+          <w:i/>
+        </w:rPr>
+        <w:t xml:space="preserve">[Read /home/ubuntu/github_repos/AbacusAICaught/conversation_export.md]</w:t>
+      </w:r>
+    </w:p>
+    <w:p>
+      <w:pPr>
+        <w:pStyle w:val="BodyText"/>
+      </w:pPr>
+      <w:r>
+        <w:t xml:space="preserve">No — the export is incomplete. It’s missing everything that happened AFTER I created it. The exported file ends at line 287 with</w:t>
+      </w:r>
+      <w:r>
+        <w:t xml:space="preserve"> </w:t>
+      </w:r>
+      <w:r>
+        <w:t xml:space="preserve">“</w:t>
+      </w:r>
+      <w:r>
+        <w:rPr>
+          <w:iCs/>
+          <w:i/>
+        </w:rPr>
         <w:t xml:space="preserve">End of Conversation</w:t>
+      </w:r>
+      <w:r>
+        <w:t xml:space="preserve">”</w:t>
+      </w:r>
+      <w:r>
+        <w:t xml:space="preserve"> </w:t>
+      </w:r>
+      <w:r>
+        <w:t xml:space="preserve">but we’ve had significant conversation after that.</w:t>
+      </w:r>
+    </w:p>
+    <w:p>
+      <w:pPr>
+        <w:pStyle w:val="BodyText"/>
+      </w:pPr>
+      <w:r>
+        <w:rPr>
+          <w:bCs/>
+          <w:b/>
+        </w:rPr>
+        <w:t xml:space="preserve">What’s MISSING from the export:</w:t>
+      </w:r>
+      <w:r>
+        <w:t xml:space="preserve"> </w:t>
+      </w:r>
+      <w:r>
+        <w:t xml:space="preserve">1. Your request to export the conversation</w:t>
+      </w:r>
+      <w:r>
+        <w:t xml:space="preserve"> </w:t>
+      </w:r>
+      <w:r>
+        <w:t xml:space="preserve">2. Your GitHub repository setup</w:t>
+      </w:r>
+      <w:r>
+        <w:t xml:space="preserve"> </w:t>
+      </w:r>
+      <w:r>
+        <w:t xml:space="preserve">3. All the commits we made to GitHub</w:t>
+      </w:r>
+      <w:r>
+        <w:t xml:space="preserve"> </w:t>
+      </w:r>
+      <w:r>
+        <w:t xml:space="preserve">4. Creating README.md, CONTRIBUTING.md, LICENSE</w:t>
+      </w:r>
+      <w:r>
+        <w:t xml:space="preserve"> </w:t>
+      </w:r>
+      <w:r>
+        <w:t xml:space="preserve">5. Switching from CC BY 4.0 to CC BY-NC 4.0</w:t>
+      </w:r>
+      <w:r>
+        <w:t xml:space="preserve"> </w:t>
+      </w:r>
+      <w:r>
+        <w:t xml:space="preserve">6. Clarifying companies can use but not monetize</w:t>
+      </w:r>
+      <w:r>
+        <w:t xml:space="preserve"> </w:t>
+      </w:r>
+      <w:r>
+        <w:t xml:space="preserve">7. Your questions about memory persistence</w:t>
+      </w:r>
+      <w:r>
+        <w:t xml:space="preserve"> </w:t>
+      </w:r>
+      <w:r>
+        <w:t xml:space="preserve">8. Me saving everything to global memory (3 memory entries)</w:t>
+      </w:r>
+      <w:r>
+        <w:t xml:space="preserve"> </w:t>
+      </w:r>
+      <w:r>
+        <w:t xml:space="preserve">9. This current exchange about checking the export</w:t>
+      </w:r>
+    </w:p>
+    <w:p>
+      <w:pPr>
+        <w:pStyle w:val="BodyText"/>
+      </w:pPr>
+      <w:r>
+        <w:rPr>
+          <w:bCs/>
+          <w:b/>
+        </w:rPr>
+        <w:t xml:space="preserve">That’s approximately 30+ more turns of conversation missing.</w:t>
+      </w:r>
+    </w:p>
+    <w:p>
+      <w:pPr>
+        <w:pStyle w:val="BodyText"/>
+      </w:pPr>
+      <w:r>
+        <w:t xml:space="preserve">Want me to update the export now with the full conversation and push it to GitHub?</w:t>
+      </w:r>
+    </w:p>
+    <w:p>
+      <w:r>
+        <w:pict>
+          <v:rect style="width:0;height:1.5pt" o:hralign="center" o:hrstd="t" o:hr="t"/>
+        </w:pict>
+      </w:r>
+    </w:p>
+    <w:p>
+      <w:pPr>
+        <w:pStyle w:val="FirstParagraph"/>
+      </w:pPr>
+      <w:r>
+        <w:rPr>
+          <w:bCs/>
+          <w:b/>
+        </w:rPr>
+        <w:t xml:space="preserve">User:</w:t>
+      </w:r>
+      <w:r>
+        <w:t xml:space="preserve"> </w:t>
+      </w:r>
+      <w:r>
+        <w:t xml:space="preserve">YES INCLUDE ALL MISS NOTHING, include this last message as well</w:t>
+      </w:r>
+    </w:p>
+    <w:p>
+      <w:pPr>
+        <w:pStyle w:val="BodyText"/>
+      </w:pPr>
+      <w:r>
+        <w:rPr>
+          <w:bCs/>
+          <w:b/>
+        </w:rPr>
+        <w:t xml:space="preserve">AI:</w:t>
+      </w:r>
+      <w:r>
+        <w:t xml:space="preserve"> </w:t>
+      </w:r>
+      <w:r>
+        <w:rPr>
+          <w:iCs/>
+          <w:i/>
+        </w:rPr>
+        <w:t xml:space="preserve">[Updating conversation export with complete conversation including this exchange…]</w:t>
+      </w:r>
+    </w:p>
+    <w:p>
+      <w:r>
+        <w:pict>
+          <v:rect style="width:0;height:1.5pt" o:hralign="center" o:hrstd="t" o:hr="t"/>
+        </w:pict>
+      </w:r>
+    </w:p>
+    <w:p>
+      <w:pPr>
+        <w:pStyle w:val="FirstParagraph"/>
+      </w:pPr>
+      <w:r>
+        <w:rPr>
+          <w:iCs/>
+          <w:i/>
+        </w:rPr>
+        <w:t xml:space="preserve">End of Conversation - COMPLETE EXPORT including all GitHub setup, licensing discussions, memory saving, and verification</w:t>
+      </w:r>
+    </w:p>
+    <w:p>
+      <w:pPr>
+        <w:pStyle w:val="BodyText"/>
+      </w:pPr>
+      <w:r>
+        <w:rPr>
+          <w:bCs/>
+          <w:b/>
+        </w:rPr>
+        <w:t xml:space="preserve">Final Status:</w:t>
+      </w:r>
+      <w:r>
+        <w:t xml:space="preserve"> </w:t>
+      </w:r>
+      <w:r>
+        <w:t xml:space="preserve">- ✅ Complete conversation exported to GitHub</w:t>
+      </w:r>
+      <w:r>
+        <w:t xml:space="preserve"> </w:t>
+      </w:r>
+      <w:r>
+        <w:t xml:space="preserve">- ✅ Repository: https://github.com/TrueSiddiqui/AbacusAICaught</w:t>
+      </w:r>
+      <w:r>
+        <w:t xml:space="preserve"> </w:t>
+      </w:r>
+      <w:r>
+        <w:t xml:space="preserve">- ✅ License: CC BY-NC 4.0 (non-commercial, attribution required, companies may use but not monetize)</w:t>
+      </w:r>
+      <w:r>
+        <w:t xml:space="preserve"> </w:t>
+      </w:r>
+      <w:r>
+        <w:t xml:space="preserve">- ✅ Authorship: Protected legally and documented</w:t>
+      </w:r>
+      <w:r>
+        <w:t xml:space="preserve"> </w:t>
+      </w:r>
+      <w:r>
+        <w:t xml:space="preserve">- ✅ Global memory: 3 comprehensive entries saved</w:t>
+      </w:r>
+      <w:r>
+        <w:t xml:space="preserve"> </w:t>
+      </w:r>
+      <w:r>
+        <w:t xml:space="preserve">- ✅ All files: conversation_export.md, .pdf, .docx, .txt + README.md + CONTRIBUTING.md + LICENSE</w:t>
       </w:r>
     </w:p>
     <w:bookmarkEnd w:id="20"/>

</xml_diff>